<commit_message>
Improve annual donor giving statements
</commit_message>
<xml_diff>
--- a/admin/resources/JoshBeyondBorders-Donor-Giving-Letter-Template.docx
+++ b/admin/resources/JoshBeyondBorders-Donor-Giving-Letter-Template.docx
@@ -32,6 +32,46 @@
                     <a:xfrm>
                       <a:off x="0" y="0"/>
                       <a:ext cx="804672" cy="804672"/>
+                    </a:xfrm>
+                    <a:prstGeom prst="rect"/>
+                  </pic:spPr>
+                </pic:pic>
+              </a:graphicData>
+            </a:graphic>
+          </wp:inline>
+        </w:drawing>
+      </w:r>
+      <w:r>
+        <w:rPr>
+          <w:sz w:val="16"/>
+        </w:rPr>
+        <w:t xml:space="preserve">      </w:t>
+      </w:r>
+      <w:r>
+        <w:drawing>
+          <wp:inline xmlns:a="http://schemas.openxmlformats.org/drawingml/2006/main" xmlns:pic="http://schemas.openxmlformats.org/drawingml/2006/picture">
+            <wp:extent cx="1664208" cy="566432"/>
+            <wp:docPr id="2" name="Picture 2" title="Christian Steps Ministries" descr="Christian Steps Ministries logo with green footprints"/>
+            <wp:cNvGraphicFramePr>
+              <a:graphicFrameLocks noChangeAspect="1"/>
+            </wp:cNvGraphicFramePr>
+            <a:graphic>
+              <a:graphicData uri="http://schemas.openxmlformats.org/drawingml/2006/picture">
+                <pic:pic>
+                  <pic:nvPicPr>
+                    <pic:cNvPr id="0" name="LogoFeetGreen.png"/>
+                    <pic:cNvPicPr/>
+                  </pic:nvPicPr>
+                  <pic:blipFill>
+                    <a:blip r:embed="rId16"/>
+                    <a:stretch>
+                      <a:fillRect/>
+                    </a:stretch>
+                  </pic:blipFill>
+                  <pic:spPr>
+                    <a:xfrm>
+                      <a:off x="0" y="0"/>
+                      <a:ext cx="1664208" cy="566432"/>
                     </a:xfrm>
                     <a:prstGeom prst="rect"/>
                   </pic:spPr>
@@ -321,7 +361,7 @@
           <w:color w:val="252525"/>
           <w:sz w:val="21"/>
         </w:rPr>
-        <w:t>Christian Steps Ministries receives and processes donations made in support of Josh Beyond Borders. Josh Beyond Borders operates under Christian Steps Ministries, a tax-exempt organization recognized under Section 501(c)(3) of the Internal Revenue Code.</w:t>
+        <w:t>Josh Beyond Borders is a ministry of Christian Steps Ministries. Christian Steps Ministries receives and processes all donations made in support of Josh Beyond Borders and is a tax-exempt organization recognized under Section 501(c)(3) of the Internal Revenue Code.</w:t>
       </w:r>
     </w:p>
     <w:tbl>
@@ -384,7 +424,21 @@
           <w:color w:val="10284B"/>
           <w:sz w:val="20"/>
         </w:rPr>
-        <w:t>CONTRIBUTION DETAILS</w:t>
+        <w:t>ITEMIZED [[TAX_YEAR]] GIVING SUMMARY</w:t>
+      </w:r>
+    </w:p>
+    <w:p>
+      <w:pPr>
+        <w:spacing w:before="0" w:after="100"/>
+      </w:pPr>
+      <w:r>
+        <w:rPr>
+          <w:rFonts w:ascii="Aptos" w:hAnsi="Aptos"/>
+          <w:i/>
+          <w:color w:val="595959"/>
+          <w:sz w:val="19"/>
+        </w:rPr>
+        <w:t>Every contribution recorded for [[TAX_YEAR]] is listed below.</w:t>
       </w:r>
     </w:p>
     <w:tbl>
@@ -645,7 +699,7 @@
           <w:color w:val="252525"/>
           <w:sz w:val="21"/>
         </w:rPr>
-        <w:t xml:space="preserve">Total Annual Giving: </w:t>
+        <w:t>Total [[TAX_YEAR]] Giving: [[TOTAL_GIFT_AMOUNT]]</w:t>
       </w:r>
       <w:r>
         <w:rPr>
@@ -654,7 +708,6 @@
           <w:color w:val="6B375F"/>
           <w:sz w:val="21"/>
         </w:rPr>
-        <w:t>[[TOTAL_GIFT_AMOUNT]]</w:t>
       </w:r>
     </w:p>
     <w:p>
@@ -682,6 +735,8 @@
           <w:sz w:val="21"/>
         </w:rPr>
         <w:t>Josh Beyond Borders</w:t>
+        <w:br/>
+        <w:t>A ministry of Christian Steps Ministries</w:t>
       </w:r>
       <w:r>
         <w:rPr>
@@ -690,8 +745,6 @@
           <w:color w:val="565656"/>
           <w:sz w:val="19"/>
         </w:rPr>
-        <w:br/>
-        <w:t>under Christian Steps Ministries</w:t>
       </w:r>
     </w:p>
     <w:sectPr>

</xml_diff>